<commit_message>
sync: devin/1791016708-one-many-vortex (subdir: one_many_vortex) — final QC gate, locked package
Co-Authored-By: Tatsuki Onishi <bougtoir@gmail.com>
</commit_message>
<xml_diff>
--- a/build/manuscript_clean_FINAL.docx
+++ b/build/manuscript_clean_FINAL.docx
@@ -103,7 +103,7 @@
           <w:b w:val="0"/>
           <w:i w:val="0"/>
         </w:rPr>
-        <w:t>The monotheism/polytheism distinction entered scholarship already carrying a direction. Tylor's animist sequence implied that plurality was earlier and simpler (Tylor 1871); Lang's "high gods" and Schmidt's Urmonotheismus answered that the original form was unitary and that multiplication was decay (Schmidt 1931). The debate's participants shared more than they contested: all assumed that the count of divine agents mapped onto an axis of development, so that establishing the direction of historical change settled the direction of development. Evans-Pritchard's critique (1965) dismantled the evidential base of both schools, but the grammatical form — transformation read as progression or regression along the One–Many axis — survived in softened forms.</w:t>
+        <w:t>The monotheism/polytheism distinction entered scholarship already carrying a direction. Tylor's animist sequence implied that plurality was earlier and simpler (Tylor 1871); Lang's "high gods" (Lang 1898) and Schmidt's Urmonotheismus answered that the original form was unitary and that multiplication was decay (Schmidt 1931). The debate's participants shared more than they contested: all assumed that the count of divine agents mapped onto an axis of development, so that establishing the direction of historical change settled the direction of development. Evans-Pritchard's critique (1965) dismantled the evidential base of both schools, but the grammatical form — transformation read as progression or regression along the One–Many axis — survived in softened forms.</w:t>
       </w:r>
     </w:p>
     <w:p>
@@ -112,7 +112,7 @@
           <w:b w:val="0"/>
           <w:i w:val="0"/>
         </w:rPr>
-        <w:t>Bellah's evolutionary sociology gave that grammar its most influential modern statement: religious symbol systems evolve from compact to differentiated (Bellah 1964). The axial-age literature retained the asymmetry even where it rejected the word "evolution" (Jaspers 1953; Bellah and Joas 2012). Meanwhile the "world religions" paradigm reified religions as countable wholes with stable essences, against which Masuzawa (2005), W. C. Smith (1962), and Josephson (2012) have shown the categories themselves to be historically manufactured. Within the category specifically at issue here, a recent wave of scholarship has attacked the binary directly: Versnel's demonstration that Greek religiosity operated simultaneously on incompatible registers (1990; 2011); the pagan-monotheism literature showing that "one god" language in late antiquity marked neither doctrine nor exclusivity (Athanassiadi and Frede 1999; Mitchell and Van Nuffelen 2010); philosophical decompositions of deity, god, and ultimate showing the count underdetermined (Steinhart 2013); and the proposal to replace the pair with mono-/multi-devotionalism (Hedges 2025; Schneider 2008). Assmann's Mosaic distinction relocated the real boundary from number to truth: what monotheism introduced was not one god but the true/false partition of religion (Assmann 1996; 2010). Table 1 summarizes this prior landscape and marks the novelty boundary the present argument must respect.</w:t>
+        <w:t>Bellah's evolutionary sociology gave that grammar its most influential modern statement: religious symbol systems evolve from compact to differentiated (Bellah 1964). The axial-age literature retained the asymmetry even where it rejected the word "evolution" (Jaspers 1953; Bellah and Joas 2012). Meanwhile the "world religions" paradigm reified religions as countable wholes with stable essences, against which Masuzawa (2005), W. C. Smith (1962), J. Z. Smith (1982), and Josephson (2012) have shown the categories themselves to be historically manufactured. Within the category specifically at issue here, a recent wave of scholarship has attacked the binary directly: Versnel's demonstration that Greek religiosity operated simultaneously on incompatible registers (1990; 2011); the pagan-monotheism literature showing that "one god" language in late antiquity marked neither doctrine nor exclusivity (Athanassiadi and Frede 1999; Mitchell and Van Nuffelen 2010); philosophical decompositions of deity, god, and ultimate showing the count underdetermined (Steinhart 2013); and the proposal to replace the pair with mono-/multi-devotionalism (Hedges 2025; Schneider 2008). Assmann's Mosaic distinction relocated the real boundary from number to truth: what monotheism introduced was not one god but the true/false partition of religion (Assmann 1996; 2010). Table 1 summarizes this prior landscape and marks the novelty boundary the present argument must respect.</w:t>
       </w:r>
     </w:p>
     <w:p>
@@ -1251,45 +1251,6 @@
         <w:jc w:val="center"/>
       </w:pPr>
       <w:r>
-        <w:drawing>
-          <wp:inline xmlns:a="http://schemas.openxmlformats.org/drawingml/2006/main" xmlns:pic="http://schemas.openxmlformats.org/drawingml/2006/picture">
-            <wp:extent cx="5120640" cy="1764480"/>
-            <wp:docPr id="1" name="Picture 1"/>
-            <wp:cNvGraphicFramePr>
-              <a:graphicFrameLocks noChangeAspect="1"/>
-            </wp:cNvGraphicFramePr>
-            <a:graphic>
-              <a:graphicData uri="http://schemas.openxmlformats.org/drawingml/2006/picture">
-                <pic:pic>
-                  <pic:nvPicPr>
-                    <pic:cNvPr id="0" name="fig1_architectures.png"/>
-                    <pic:cNvPicPr/>
-                  </pic:nvPicPr>
-                  <pic:blipFill>
-                    <a:blip r:embed="rId9"/>
-                    <a:stretch>
-                      <a:fillRect/>
-                    </a:stretch>
-                  </pic:blipFill>
-                  <pic:spPr>
-                    <a:xfrm>
-                      <a:off x="0" y="0"/>
-                      <a:ext cx="5120640" cy="1764480"/>
-                    </a:xfrm>
-                    <a:prstGeom prst="rect"/>
-                  </pic:spPr>
-                </pic:pic>
-              </a:graphicData>
-            </a:graphic>
-          </wp:inline>
-        </w:drawing>
-      </w:r>
-    </w:p>
-    <w:p>
-      <w:pPr>
-        <w:jc w:val="center"/>
-      </w:pPr>
-      <w:r>
         <w:rPr>
           <w:sz w:val="20"/>
         </w:rPr>
@@ -1434,7 +1395,27 @@
               <w:rPr>
                 <w:sz w:val="20"/>
               </w:rPr>
-              <w:t>Assignment weights w_ij linking each feature to each agent; the representational architecture</w:t>
+              <w:t xml:space="preserve">Assignment weights </w:t>
+            </w:r>
+            <w:r>
+              <w:rPr>
+                <w:i/>
+                <w:sz w:val="20"/>
+              </w:rPr>
+              <w:t>w</w:t>
+            </w:r>
+            <w:r>
+              <w:rPr>
+                <w:sz w:val="20"/>
+                <w:vertAlign w:val="subscript"/>
+              </w:rPr>
+              <w:t>ij</w:t>
+            </w:r>
+            <w:r>
+              <w:rPr>
+                <w:sz w:val="20"/>
+              </w:rPr>
+              <w:t xml:space="preserve"> linking each feature to each agent; the representational architecture</w:t>
             </w:r>
           </w:p>
         </w:tc>
@@ -2788,45 +2769,6 @@
         <w:jc w:val="center"/>
       </w:pPr>
       <w:r>
-        <w:drawing>
-          <wp:inline xmlns:a="http://schemas.openxmlformats.org/drawingml/2006/main" xmlns:pic="http://schemas.openxmlformats.org/drawingml/2006/picture">
-            <wp:extent cx="5120640" cy="4993744"/>
-            <wp:docPr id="2" name="Picture 2"/>
-            <wp:cNvGraphicFramePr>
-              <a:graphicFrameLocks noChangeAspect="1"/>
-            </wp:cNvGraphicFramePr>
-            <a:graphic>
-              <a:graphicData uri="http://schemas.openxmlformats.org/drawingml/2006/picture">
-                <pic:pic>
-                  <pic:nvPicPr>
-                    <pic:cNvPr id="0" name="fig2_vortex.png"/>
-                    <pic:cNvPicPr/>
-                  </pic:nvPicPr>
-                  <pic:blipFill>
-                    <a:blip r:embed="rId10"/>
-                    <a:stretch>
-                      <a:fillRect/>
-                    </a:stretch>
-                  </pic:blipFill>
-                  <pic:spPr>
-                    <a:xfrm>
-                      <a:off x="0" y="0"/>
-                      <a:ext cx="5120640" cy="4993744"/>
-                    </a:xfrm>
-                    <a:prstGeom prst="rect"/>
-                  </pic:spPr>
-                </pic:pic>
-              </a:graphicData>
-            </a:graphic>
-          </wp:inline>
-        </w:drawing>
-      </w:r>
-    </w:p>
-    <w:p>
-      <w:pPr>
-        <w:jc w:val="center"/>
-      </w:pPr>
-      <w:r>
         <w:rPr>
           <w:sz w:val="20"/>
         </w:rPr>
@@ -2992,45 +2934,6 @@
           <w:i w:val="0"/>
         </w:rPr>
         <w:t>. In the first movement, a divine representation expresses or carries a norm: a law, custom, or social requirement is predicated of, narrated through, or attributed to a divine agent — Hammurabi receives the law from Šamaš; ma'at is carried by the gods. In the second movement, the dependency inverts: the norm is authoritative because it expresses divine will. What changed is not the norm's content but the direction of the warrant: after inversion, the norm's authority does not survive the removal of its divine underwriting, whereas before, the divine representation was one carrier among others of a norm with independent standing. Feuerbach (1841) described projection from human predicates to the divine; Norenzayan's Big Gods account (2013) describes norms assigned to supernatural monitors — an empirical program whose global-historical testing remains contested (Beheim et al. 2021; Whitehouse et al. 2023, the corrected "retake" of the retracted Whitehouse et al. 2019); representational inversion is the representational converse of both — a shift in the direction of authorization within a functioning representation, not a claim about origins. It is not asserted as the origin of religion, not confined to monotheism, and not a stage; it is a re-wiring operation that histories can instantiate partially and reversibly (Figure 3).</w:t>
-      </w:r>
-    </w:p>
-    <w:p>
-      <w:pPr>
-        <w:jc w:val="center"/>
-      </w:pPr>
-      <w:r>
-        <w:drawing>
-          <wp:inline xmlns:a="http://schemas.openxmlformats.org/drawingml/2006/main" xmlns:pic="http://schemas.openxmlformats.org/drawingml/2006/picture">
-            <wp:extent cx="5120640" cy="2209862"/>
-            <wp:docPr id="3" name="Picture 3"/>
-            <wp:cNvGraphicFramePr>
-              <a:graphicFrameLocks noChangeAspect="1"/>
-            </wp:cNvGraphicFramePr>
-            <a:graphic>
-              <a:graphicData uri="http://schemas.openxmlformats.org/drawingml/2006/picture">
-                <pic:pic>
-                  <pic:nvPicPr>
-                    <pic:cNvPr id="0" name="fig3_inversion.png"/>
-                    <pic:cNvPicPr/>
-                  </pic:nvPicPr>
-                  <pic:blipFill>
-                    <a:blip r:embed="rId11"/>
-                    <a:stretch>
-                      <a:fillRect/>
-                    </a:stretch>
-                  </pic:blipFill>
-                  <pic:spPr>
-                    <a:xfrm>
-                      <a:off x="0" y="0"/>
-                      <a:ext cx="5120640" cy="2209862"/>
-                    </a:xfrm>
-                    <a:prstGeom prst="rect"/>
-                  </pic:spPr>
-                </pic:pic>
-              </a:graphicData>
-            </a:graphic>
-          </wp:inline>
-        </w:drawing>
       </w:r>
     </w:p>
     <w:p>
@@ -4626,45 +4529,6 @@
         <w:jc w:val="center"/>
       </w:pPr>
       <w:r>
-        <w:drawing>
-          <wp:inline xmlns:a="http://schemas.openxmlformats.org/drawingml/2006/main" xmlns:pic="http://schemas.openxmlformats.org/drawingml/2006/picture">
-            <wp:extent cx="5120640" cy="2645421"/>
-            <wp:docPr id="4" name="Picture 4"/>
-            <wp:cNvGraphicFramePr>
-              <a:graphicFrameLocks noChangeAspect="1"/>
-            </wp:cNvGraphicFramePr>
-            <a:graphic>
-              <a:graphicData uri="http://schemas.openxmlformats.org/drawingml/2006/picture">
-                <pic:pic>
-                  <pic:nvPicPr>
-                    <pic:cNvPr id="0" name="fig4_paths.png"/>
-                    <pic:cNvPicPr/>
-                  </pic:nvPicPr>
-                  <pic:blipFill>
-                    <a:blip r:embed="rId12"/>
-                    <a:stretch>
-                      <a:fillRect/>
-                    </a:stretch>
-                  </pic:blipFill>
-                  <pic:spPr>
-                    <a:xfrm>
-                      <a:off x="0" y="0"/>
-                      <a:ext cx="5120640" cy="2645421"/>
-                    </a:xfrm>
-                    <a:prstGeom prst="rect"/>
-                  </pic:spPr>
-                </pic:pic>
-              </a:graphicData>
-            </a:graphic>
-          </wp:inline>
-        </w:drawing>
-      </w:r>
-    </w:p>
-    <w:p>
-      <w:pPr>
-        <w:jc w:val="center"/>
-      </w:pPr>
-      <w:r>
         <w:rPr>
           <w:sz w:val="20"/>
         </w:rPr>
@@ -5826,45 +5690,6 @@
         <w:jc w:val="center"/>
       </w:pPr>
       <w:r>
-        <w:drawing>
-          <wp:inline xmlns:a="http://schemas.openxmlformats.org/drawingml/2006/main" xmlns:pic="http://schemas.openxmlformats.org/drawingml/2006/picture">
-            <wp:extent cx="5120640" cy="5451103"/>
-            <wp:docPr id="5" name="Picture 5"/>
-            <wp:cNvGraphicFramePr>
-              <a:graphicFrameLocks noChangeAspect="1"/>
-            </wp:cNvGraphicFramePr>
-            <a:graphic>
-              <a:graphicData uri="http://schemas.openxmlformats.org/drawingml/2006/picture">
-                <pic:pic>
-                  <pic:nvPicPr>
-                    <pic:cNvPr id="0" name="fig5_statespace.png"/>
-                    <pic:cNvPicPr/>
-                  </pic:nvPicPr>
-                  <pic:blipFill>
-                    <a:blip r:embed="rId13"/>
-                    <a:stretch>
-                      <a:fillRect/>
-                    </a:stretch>
-                  </pic:blipFill>
-                  <pic:spPr>
-                    <a:xfrm>
-                      <a:off x="0" y="0"/>
-                      <a:ext cx="5120640" cy="5451103"/>
-                    </a:xfrm>
-                    <a:prstGeom prst="rect"/>
-                  </pic:spPr>
-                </pic:pic>
-              </a:graphicData>
-            </a:graphic>
-          </wp:inline>
-        </w:drawing>
-      </w:r>
-    </w:p>
-    <w:p>
-      <w:pPr>
-        <w:jc w:val="center"/>
-      </w:pPr>
-      <w:r>
         <w:rPr>
           <w:sz w:val="20"/>
         </w:rPr>
@@ -6827,7 +6652,7 @@
           <w:i w:val="0"/>
           <w:sz w:val="24"/>
         </w:rPr>
-        <w:t xml:space="preserve"> 56: 48–67. https://doi.org/10.2307/2928715</w:t>
+        <w:t xml:space="preserve"> 56: 48–67. https://doi.org/10.2307/2928707</w:t>
       </w:r>
     </w:p>
     <w:p>
@@ -7079,7 +6904,7 @@
           <w:i w:val="0"/>
           <w:sz w:val="24"/>
         </w:rPr>
-        <w:t xml:space="preserve"> 29(3): 358–374. https://doi.org/10.2307/2091929</w:t>
+        <w:t xml:space="preserve"> 29(3): 358–374. https://doi.org/10.2307/2091480</w:t>
       </w:r>
     </w:p>
     <w:p>
@@ -7430,7 +7255,7 @@
           <w:i w:val="0"/>
           <w:sz w:val="24"/>
         </w:rPr>
-        <w:t xml:space="preserve"> 104(18): 7357–7360. https://doi.org/10.1073/pnas.0700591104</w:t>
+        <w:t xml:space="preserve"> 104(18): 7357–7360. https://doi.org/10.1073/pnas.0701768104</w:t>
       </w:r>
     </w:p>
     <w:p>
@@ -7611,6 +7436,34 @@
           <w:i w:val="0"/>
           <w:sz w:val="24"/>
         </w:rPr>
+        <w:t xml:space="preserve">Klostermaier, Klaus. 2007. </w:t>
+      </w:r>
+      <w:r>
+        <w:rPr>
+          <w:i/>
+          <w:sz w:val="24"/>
+        </w:rPr>
+        <w:t>A Survey of Hinduism</w:t>
+      </w:r>
+      <w:r>
+        <w:rPr>
+          <w:b w:val="0"/>
+          <w:i w:val="0"/>
+          <w:sz w:val="24"/>
+        </w:rPr>
+        <w:t>, 3rd ed. Albany: SUNY Press.</w:t>
+      </w:r>
+    </w:p>
+    <w:p>
+      <w:pPr>
+        <w:ind w:left="576" w:hanging="576"/>
+      </w:pPr>
+      <w:r>
+        <w:rPr>
+          <w:b w:val="0"/>
+          <w:i w:val="0"/>
+          <w:sz w:val="24"/>
+        </w:rPr>
         <w:t xml:space="preserve">Lang, Andrew. 1898. </w:t>
       </w:r>
       <w:r>
@@ -7627,34 +7480,6 @@
           <w:sz w:val="24"/>
         </w:rPr>
         <w:t>. London: Longmans, Green.</w:t>
-      </w:r>
-    </w:p>
-    <w:p>
-      <w:pPr>
-        <w:ind w:left="576" w:hanging="576"/>
-      </w:pPr>
-      <w:r>
-        <w:rPr>
-          <w:b w:val="0"/>
-          <w:i w:val="0"/>
-          <w:sz w:val="24"/>
-        </w:rPr>
-        <w:t xml:space="preserve">Klostermaier, Klaus. 2007. </w:t>
-      </w:r>
-      <w:r>
-        <w:rPr>
-          <w:i/>
-          <w:sz w:val="24"/>
-        </w:rPr>
-        <w:t>A Survey of Hinduism</w:t>
-      </w:r>
-      <w:r>
-        <w:rPr>
-          <w:b w:val="0"/>
-          <w:i w:val="0"/>
-          <w:sz w:val="24"/>
-        </w:rPr>
-        <w:t>, 3rd ed. Albany: SUNY Press.</w:t>
       </w:r>
     </w:p>
     <w:p>
@@ -8046,7 +7871,7 @@
           <w:i w:val="0"/>
           <w:sz w:val="24"/>
         </w:rPr>
-        <w:t xml:space="preserve"> 6(1): 77–107. https://doi.org/10.21237/C7clio6127693</w:t>
+        <w:t xml:space="preserve"> 6(1): 77–107. https://doi.org/10.21237/C7clio6127917</w:t>
       </w:r>
     </w:p>
     <w:p>

</xml_diff>